<commit_message>
replace PA6/10 + TIM2 with PC6/7 + TIM3 becase of possible pin burn.
</commit_message>
<xml_diff>
--- a/doc/cleanair_intelligent_ac_vent_fan_controller.docx
+++ b/doc/cleanair_intelligent_ac_vent_fan_controller.docx
@@ -10,6 +10,7 @@
         <w:rPr>
           <w:rFonts w:ascii="Google Sans;sans-serif" w:hAnsi="Google Sans;sans-serif"/>
           <w:b/>
+          <w:b/>
           <w:strike w:val="false"/>
           <w:dstrike w:val="false"/>
           <w:sz w:val="30"/>
@@ -40,6 +41,7 @@
         <w:rPr>
           <w:rFonts w:ascii="Google Sans;sans-serif" w:hAnsi="Google Sans;sans-serif"/>
           <w:b/>
+          <w:b/>
           <w:strike w:val="false"/>
           <w:dstrike w:val="false"/>
           <w:sz w:val="30"/>
@@ -71,7 +73,7 @@
       </w:pPr>
       <w:r>
         <w:rPr>
-          <w:rStyle w:val="StrongEmphasis"/>
+          <w:rStyle w:val="Strong"/>
           <w:rFonts w:ascii="Google Sans;sans-serif" w:hAnsi="Google Sans;sans-serif"/>
           <w:b/>
           <w:strike w:val="false"/>
@@ -97,7 +99,7 @@
       </w:r>
       <w:r>
         <w:rPr>
-          <w:rStyle w:val="StrongEmphasis"/>
+          <w:rStyle w:val="Strong"/>
           <w:rFonts w:ascii="Google Sans;sans-serif" w:hAnsi="Google Sans;sans-serif"/>
           <w:b/>
           <w:strike w:val="false"/>
@@ -147,6 +149,7 @@
         <w:rPr>
           <w:rFonts w:ascii="Google Sans;sans-serif" w:hAnsi="Google Sans;sans-serif"/>
           <w:b/>
+          <w:b/>
           <w:strike w:val="false"/>
           <w:dstrike w:val="false"/>
           <w:sz w:val="30"/>
@@ -176,6 +179,7 @@
         <w:jc w:val="left"/>
         <w:rPr>
           <w:rFonts w:ascii="Google Sans;sans-serif" w:hAnsi="Google Sans;sans-serif"/>
+          <w:b w:val="false"/>
           <w:b w:val="false"/>
           <w:strike w:val="false"/>
           <w:dstrike w:val="false"/>
@@ -223,6 +227,7 @@
         <w:rPr>
           <w:rFonts w:ascii="Google Sans;sans-serif" w:hAnsi="Google Sans;sans-serif"/>
           <w:b/>
+          <w:b/>
           <w:strike w:val="false"/>
           <w:dstrike w:val="false"/>
           <w:sz w:val="30"/>
@@ -253,6 +258,7 @@
         <w:rPr>
           <w:rFonts w:ascii="Google Sans;sans-serif" w:hAnsi="Google Sans;sans-serif"/>
           <w:b/>
+          <w:b/>
           <w:strike w:val="false"/>
           <w:dstrike w:val="false"/>
           <w:sz w:val="30"/>
@@ -283,6 +289,7 @@
         <w:rPr>
           <w:rFonts w:ascii="Google Sans;sans-serif" w:hAnsi="Google Sans;sans-serif"/>
           <w:b w:val="false"/>
+          <w:b w:val="false"/>
           <w:strike w:val="false"/>
           <w:dstrike w:val="false"/>
           <w:sz w:val="24"/>
@@ -306,7 +313,6 @@
     <w:p>
       <w:pPr>
         <w:pStyle w:val="PreformattedText"/>
-        <w:pBdr/>
         <w:bidi w:val="0"/>
         <w:spacing w:before="0" w:after="0"/>
         <w:ind w:left="0" w:right="0" w:hanging="0"/>
@@ -339,7 +345,6 @@
     <w:p>
       <w:pPr>
         <w:pStyle w:val="PreformattedText"/>
-        <w:pBdr/>
         <w:bidi w:val="0"/>
         <w:spacing w:before="0" w:after="0"/>
         <w:rPr/>
@@ -351,7 +356,6 @@
     <w:p>
       <w:pPr>
         <w:pStyle w:val="PreformattedText"/>
-        <w:pBdr/>
         <w:bidi w:val="0"/>
         <w:spacing w:before="0" w:after="0"/>
         <w:rPr/>
@@ -383,7 +387,6 @@
     <w:p>
       <w:pPr>
         <w:pStyle w:val="PreformattedText"/>
-        <w:pBdr/>
         <w:bidi w:val="0"/>
         <w:spacing w:before="0" w:after="0"/>
         <w:rPr/>
@@ -415,7 +418,6 @@
     <w:p>
       <w:pPr>
         <w:pStyle w:val="PreformattedText"/>
-        <w:pBdr/>
         <w:bidi w:val="0"/>
         <w:spacing w:before="0" w:after="0"/>
         <w:rPr/>
@@ -427,7 +429,6 @@
     <w:p>
       <w:pPr>
         <w:pStyle w:val="PreformattedText"/>
-        <w:pBdr/>
         <w:bidi w:val="0"/>
         <w:spacing w:before="0" w:after="0"/>
         <w:rPr/>
@@ -459,7 +460,6 @@
     <w:p>
       <w:pPr>
         <w:pStyle w:val="PreformattedText"/>
-        <w:pBdr/>
         <w:bidi w:val="0"/>
         <w:spacing w:before="0" w:after="0"/>
         <w:rPr/>
@@ -491,7 +491,6 @@
     <w:p>
       <w:pPr>
         <w:pStyle w:val="PreformattedText"/>
-        <w:pBdr/>
         <w:bidi w:val="0"/>
         <w:spacing w:before="0" w:after="0"/>
         <w:rPr/>
@@ -523,7 +522,6 @@
     <w:p>
       <w:pPr>
         <w:pStyle w:val="PreformattedText"/>
-        <w:pBdr/>
         <w:bidi w:val="0"/>
         <w:spacing w:before="0" w:after="0"/>
         <w:rPr/>
@@ -535,7 +533,6 @@
     <w:p>
       <w:pPr>
         <w:pStyle w:val="PreformattedText"/>
-        <w:pBdr/>
         <w:bidi w:val="0"/>
         <w:spacing w:before="0" w:after="0"/>
         <w:rPr/>
@@ -567,7 +564,6 @@
     <w:p>
       <w:pPr>
         <w:pStyle w:val="PreformattedText"/>
-        <w:pBdr/>
         <w:bidi w:val="0"/>
         <w:spacing w:before="0" w:after="0"/>
         <w:rPr/>
@@ -599,7 +595,6 @@
     <w:p>
       <w:pPr>
         <w:pStyle w:val="PreformattedText"/>
-        <w:pBdr/>
         <w:bidi w:val="0"/>
         <w:spacing w:before="0" w:after="0"/>
         <w:rPr/>
@@ -631,7 +626,6 @@
     <w:p>
       <w:pPr>
         <w:pStyle w:val="PreformattedText"/>
-        <w:pBdr/>
         <w:bidi w:val="0"/>
         <w:spacing w:before="0" w:after="0"/>
         <w:rPr/>
@@ -643,7 +637,6 @@
     <w:p>
       <w:pPr>
         <w:pStyle w:val="PreformattedText"/>
-        <w:pBdr/>
         <w:bidi w:val="0"/>
         <w:spacing w:before="0" w:after="0"/>
         <w:rPr/>
@@ -675,7 +668,6 @@
     <w:p>
       <w:pPr>
         <w:pStyle w:val="PreformattedText"/>
-        <w:pBdr/>
         <w:bidi w:val="0"/>
         <w:spacing w:before="0" w:after="0"/>
         <w:rPr/>
@@ -707,7 +699,6 @@
     <w:p>
       <w:pPr>
         <w:pStyle w:val="PreformattedText"/>
-        <w:pBdr/>
         <w:bidi w:val="0"/>
         <w:spacing w:before="0" w:after="0"/>
         <w:rPr/>
@@ -739,7 +730,6 @@
     <w:p>
       <w:pPr>
         <w:pStyle w:val="PreformattedText"/>
-        <w:pBdr/>
         <w:bidi w:val="0"/>
         <w:spacing w:before="0" w:after="0"/>
         <w:rPr/>
@@ -771,7 +761,6 @@
     <w:p>
       <w:pPr>
         <w:pStyle w:val="PreformattedText"/>
-        <w:pBdr/>
         <w:bidi w:val="0"/>
         <w:spacing w:before="0" w:after="0"/>
         <w:rPr/>
@@ -803,7 +792,6 @@
     <w:p>
       <w:pPr>
         <w:pStyle w:val="PreformattedText"/>
-        <w:pBdr/>
         <w:bidi w:val="0"/>
         <w:spacing w:before="0" w:after="0"/>
         <w:rPr/>
@@ -835,7 +823,6 @@
     <w:p>
       <w:pPr>
         <w:pStyle w:val="PreformattedText"/>
-        <w:pBdr/>
         <w:bidi w:val="0"/>
         <w:spacing w:before="0" w:after="0"/>
         <w:rPr/>
@@ -847,7 +834,6 @@
     <w:p>
       <w:pPr>
         <w:pStyle w:val="PreformattedText"/>
-        <w:pBdr/>
         <w:bidi w:val="0"/>
         <w:spacing w:before="0" w:after="0"/>
         <w:rPr/>
@@ -879,7 +865,6 @@
     <w:p>
       <w:pPr>
         <w:pStyle w:val="PreformattedText"/>
-        <w:pBdr/>
         <w:bidi w:val="0"/>
         <w:spacing w:before="0" w:after="0"/>
         <w:rPr/>
@@ -911,7 +896,6 @@
     <w:p>
       <w:pPr>
         <w:pStyle w:val="PreformattedText"/>
-        <w:pBdr/>
         <w:bidi w:val="0"/>
         <w:spacing w:before="0" w:after="0"/>
         <w:rPr/>
@@ -943,7 +927,6 @@
     <w:p>
       <w:pPr>
         <w:pStyle w:val="PreformattedText"/>
-        <w:pBdr/>
         <w:bidi w:val="0"/>
         <w:spacing w:before="0" w:after="0"/>
         <w:rPr/>
@@ -979,7 +962,6 @@
           <w:ilvl w:val="0"/>
           <w:numId w:val="1"/>
         </w:numPr>
-        <w:pBdr/>
         <w:tabs>
           <w:tab w:val="clear" w:pos="709"/>
           <w:tab w:val="left" w:pos="0" w:leader="none"/>
@@ -992,7 +974,7 @@
       </w:pPr>
       <w:r>
         <w:rPr>
-          <w:rStyle w:val="StrongEmphasis"/>
+          <w:rStyle w:val="Strong"/>
           <w:rFonts w:ascii="Google Sans;sans-serif" w:hAnsi="Google Sans;sans-serif"/>
           <w:b/>
           <w:strike w:val="false"/>
@@ -1023,7 +1005,6 @@
           <w:ilvl w:val="0"/>
           <w:numId w:val="1"/>
         </w:numPr>
-        <w:pBdr/>
         <w:tabs>
           <w:tab w:val="clear" w:pos="709"/>
           <w:tab w:val="left" w:pos="0" w:leader="none"/>
@@ -1036,7 +1017,7 @@
       </w:pPr>
       <w:r>
         <w:rPr>
-          <w:rStyle w:val="StrongEmphasis"/>
+          <w:rStyle w:val="Strong"/>
           <w:rFonts w:ascii="Google Sans;sans-serif" w:hAnsi="Google Sans;sans-serif"/>
           <w:b/>
           <w:strike w:val="false"/>
@@ -1069,6 +1050,7 @@
         <w:jc w:val="left"/>
         <w:rPr>
           <w:rFonts w:ascii="Google Sans;sans-serif" w:hAnsi="Google Sans;sans-serif"/>
+          <w:b/>
           <w:b/>
           <w:strike w:val="false"/>
           <w:dstrike w:val="false"/>
@@ -1097,7 +1079,6 @@
           <w:ilvl w:val="0"/>
           <w:numId w:val="2"/>
         </w:numPr>
-        <w:pBdr/>
         <w:tabs>
           <w:tab w:val="clear" w:pos="709"/>
           <w:tab w:val="left" w:pos="0" w:leader="none"/>
@@ -1109,7 +1090,7 @@
       </w:pPr>
       <w:r>
         <w:rPr>
-          <w:rStyle w:val="StrongEmphasis"/>
+          <w:rStyle w:val="Strong"/>
           <w:rFonts w:ascii="Google Sans;sans-serif" w:hAnsi="Google Sans;sans-serif"/>
           <w:b/>
           <w:strike w:val="false"/>
@@ -1218,7 +1199,6 @@
           <w:ilvl w:val="0"/>
           <w:numId w:val="2"/>
         </w:numPr>
-        <w:pBdr/>
         <w:tabs>
           <w:tab w:val="clear" w:pos="709"/>
           <w:tab w:val="left" w:pos="0" w:leader="none"/>
@@ -1231,7 +1211,7 @@
       </w:pPr>
       <w:r>
         <w:rPr>
-          <w:rStyle w:val="StrongEmphasis"/>
+          <w:rStyle w:val="Strong"/>
           <w:rFonts w:ascii="Google Sans;sans-serif" w:hAnsi="Google Sans;sans-serif"/>
           <w:b/>
           <w:strike w:val="false"/>
@@ -1262,7 +1242,6 @@
           <w:ilvl w:val="0"/>
           <w:numId w:val="2"/>
         </w:numPr>
-        <w:pBdr/>
         <w:tabs>
           <w:tab w:val="clear" w:pos="709"/>
           <w:tab w:val="left" w:pos="0" w:leader="none"/>
@@ -1275,7 +1254,7 @@
       </w:pPr>
       <w:r>
         <w:rPr>
-          <w:rStyle w:val="StrongEmphasis"/>
+          <w:rStyle w:val="Strong"/>
           <w:rFonts w:ascii="Google Sans;sans-serif" w:hAnsi="Google Sans;sans-serif"/>
           <w:b/>
           <w:strike w:val="false"/>
@@ -1320,6 +1299,7 @@
         <w:rPr>
           <w:rFonts w:ascii="Google Sans;sans-serif" w:hAnsi="Google Sans;sans-serif"/>
           <w:b/>
+          <w:b/>
           <w:strike w:val="false"/>
           <w:dstrike w:val="false"/>
           <w:sz w:val="30"/>
@@ -1350,6 +1330,7 @@
         <w:rPr>
           <w:rFonts w:ascii="Google Sans;sans-serif" w:hAnsi="Google Sans;sans-serif"/>
           <w:b w:val="false"/>
+          <w:b w:val="false"/>
           <w:strike w:val="false"/>
           <w:dstrike w:val="false"/>
           <w:sz w:val="24"/>
@@ -1379,6 +1360,7 @@
         <w:jc w:val="left"/>
         <w:rPr>
           <w:rFonts w:ascii="Google Sans;sans-serif" w:hAnsi="Google Sans;sans-serif"/>
+          <w:b/>
           <w:b/>
           <w:strike w:val="false"/>
           <w:dstrike w:val="false"/>
@@ -1407,7 +1389,6 @@
           <w:ilvl w:val="0"/>
           <w:numId w:val="3"/>
         </w:numPr>
-        <w:pBdr/>
         <w:tabs>
           <w:tab w:val="clear" w:pos="709"/>
           <w:tab w:val="left" w:pos="0" w:leader="none"/>
@@ -1420,7 +1401,7 @@
       </w:pPr>
       <w:r>
         <w:rPr>
-          <w:rStyle w:val="StrongEmphasis"/>
+          <w:rStyle w:val="Strong"/>
           <w:rFonts w:ascii="Google Sans;sans-serif" w:hAnsi="Google Sans;sans-serif"/>
           <w:b/>
           <w:strike w:val="false"/>
@@ -1439,7 +1420,6 @@
           <w:ilvl w:val="1"/>
           <w:numId w:val="3"/>
         </w:numPr>
-        <w:pBdr/>
         <w:tabs>
           <w:tab w:val="clear" w:pos="709"/>
           <w:tab w:val="left" w:pos="0" w:leader="none"/>
@@ -1483,7 +1463,6 @@
           <w:ilvl w:val="1"/>
           <w:numId w:val="3"/>
         </w:numPr>
-        <w:pBdr/>
         <w:tabs>
           <w:tab w:val="clear" w:pos="709"/>
           <w:tab w:val="left" w:pos="0" w:leader="none"/>
@@ -1517,19 +1496,7 @@
           <w:u w:val="none"/>
           <w:effect w:val="none"/>
         </w:rPr>
-        <w:t xml:space="preserve"> Captures heavy metallic fumes, hexavalent chromium particulates, manganese dust, and airborne ash shedding from vaporized electrodes before they choke downstream filters.</w:t>
-      </w:r>
-      <w:r>
-        <w:rPr>
-          <w:rFonts w:ascii="Google Sans;sans-serif" w:hAnsi="Google Sans;sans-serif"/>
-          <w:b w:val="false"/>
-          <w:strike w:val="false"/>
-          <w:dstrike w:val="false"/>
-          <w:sz w:val="24"/>
-          <w:u w:val="none"/>
-          <w:effect w:val="none"/>
-        </w:rPr>
-        <w:t xml:space="preserve"> [</w:t>
+        <w:t xml:space="preserve"> Captures heavy metallic fumes, hexavalent chromium particulates, manganese dust, and airborne ash shedding from vaporized electrodes before they choke downstream filters. [</w:t>
       </w:r>
       <w:hyperlink r:id="rId2">
         <w:r>
@@ -1566,7 +1533,6 @@
           <w:ilvl w:val="0"/>
           <w:numId w:val="3"/>
         </w:numPr>
-        <w:pBdr/>
         <w:tabs>
           <w:tab w:val="clear" w:pos="709"/>
           <w:tab w:val="left" w:pos="0" w:leader="none"/>
@@ -1579,7 +1545,7 @@
       </w:pPr>
       <w:r>
         <w:rPr>
-          <w:rStyle w:val="StrongEmphasis"/>
+          <w:rStyle w:val="Strong"/>
           <w:rFonts w:ascii="Google Sans;sans-serif" w:hAnsi="Google Sans;sans-serif"/>
           <w:b/>
           <w:strike w:val="false"/>
@@ -1598,7 +1564,6 @@
           <w:ilvl w:val="1"/>
           <w:numId w:val="3"/>
         </w:numPr>
-        <w:pBdr/>
         <w:tabs>
           <w:tab w:val="clear" w:pos="709"/>
           <w:tab w:val="left" w:pos="0" w:leader="none"/>
@@ -1642,7 +1607,6 @@
           <w:ilvl w:val="1"/>
           <w:numId w:val="3"/>
         </w:numPr>
-        <w:pBdr/>
         <w:tabs>
           <w:tab w:val="clear" w:pos="709"/>
           <w:tab w:val="left" w:pos="0" w:leader="none"/>
@@ -1676,19 +1640,7 @@
           <w:u w:val="none"/>
           <w:effect w:val="none"/>
         </w:rPr>
-        <w:t xml:space="preserve"> Detects high-concentration \(O_{3}\) produced by intense ultraviolet (UV) radiation from open electric arcs ionizing ambient oxygen molecules.</w:t>
-      </w:r>
-      <w:r>
-        <w:rPr>
-          <w:rFonts w:ascii="Google Sans;sans-serif" w:hAnsi="Google Sans;sans-serif"/>
-          <w:b w:val="false"/>
-          <w:strike w:val="false"/>
-          <w:dstrike w:val="false"/>
-          <w:sz w:val="24"/>
-          <w:u w:val="none"/>
-          <w:effect w:val="none"/>
-        </w:rPr>
-        <w:t xml:space="preserve"> [</w:t>
+        <w:t xml:space="preserve"> Detects high-concentration \(O_{3}\) produced by intense ultraviolet (UV) radiation from open electric arcs ionizing ambient oxygen molecules. [</w:t>
       </w:r>
       <w:hyperlink r:id="rId3">
         <w:r>
@@ -1752,7 +1704,6 @@
           <w:ilvl w:val="0"/>
           <w:numId w:val="3"/>
         </w:numPr>
-        <w:pBdr/>
         <w:tabs>
           <w:tab w:val="clear" w:pos="709"/>
           <w:tab w:val="left" w:pos="0" w:leader="none"/>
@@ -1765,7 +1716,7 @@
       </w:pPr>
       <w:r>
         <w:rPr>
-          <w:rStyle w:val="StrongEmphasis"/>
+          <w:rStyle w:val="Strong"/>
           <w:rFonts w:ascii="Google Sans;sans-serif" w:hAnsi="Google Sans;sans-serif"/>
           <w:b/>
           <w:strike w:val="false"/>
@@ -1784,7 +1735,6 @@
           <w:ilvl w:val="1"/>
           <w:numId w:val="3"/>
         </w:numPr>
-        <w:pBdr/>
         <w:tabs>
           <w:tab w:val="clear" w:pos="709"/>
           <w:tab w:val="left" w:pos="0" w:leader="none"/>
@@ -1828,7 +1778,6 @@
           <w:ilvl w:val="1"/>
           <w:numId w:val="3"/>
         </w:numPr>
-        <w:pBdr/>
         <w:tabs>
           <w:tab w:val="clear" w:pos="709"/>
           <w:tab w:val="left" w:pos="0" w:leader="none"/>
@@ -1872,7 +1821,6 @@
           <w:ilvl w:val="1"/>
           <w:numId w:val="3"/>
         </w:numPr>
-        <w:pBdr/>
         <w:tabs>
           <w:tab w:val="clear" w:pos="709"/>
           <w:tab w:val="left" w:pos="0" w:leader="none"/>
@@ -1916,7 +1864,6 @@
           <w:ilvl w:val="0"/>
           <w:numId w:val="3"/>
         </w:numPr>
-        <w:pBdr/>
         <w:tabs>
           <w:tab w:val="clear" w:pos="709"/>
           <w:tab w:val="left" w:pos="0" w:leader="none"/>
@@ -1929,7 +1876,7 @@
       </w:pPr>
       <w:r>
         <w:rPr>
-          <w:rStyle w:val="StrongEmphasis"/>
+          <w:rStyle w:val="Strong"/>
           <w:rFonts w:ascii="Google Sans;sans-serif" w:hAnsi="Google Sans;sans-serif"/>
           <w:b/>
           <w:strike w:val="false"/>
@@ -1948,7 +1895,6 @@
           <w:ilvl w:val="1"/>
           <w:numId w:val="3"/>
         </w:numPr>
-        <w:pBdr/>
         <w:tabs>
           <w:tab w:val="clear" w:pos="709"/>
           <w:tab w:val="left" w:pos="0" w:leader="none"/>
@@ -1992,7 +1938,6 @@
           <w:ilvl w:val="1"/>
           <w:numId w:val="3"/>
         </w:numPr>
-        <w:pBdr/>
         <w:tabs>
           <w:tab w:val="clear" w:pos="709"/>
           <w:tab w:val="left" w:pos="0" w:leader="none"/>
@@ -2039,6 +1984,7 @@
         <w:rPr>
           <w:rFonts w:ascii="Google Sans;sans-serif" w:hAnsi="Google Sans;sans-serif"/>
           <w:b/>
+          <w:b/>
           <w:strike w:val="false"/>
           <w:dstrike w:val="false"/>
           <w:sz w:val="30"/>
@@ -2068,6 +2014,7 @@
         <w:jc w:val="left"/>
         <w:rPr>
           <w:rFonts w:ascii="Google Sans;sans-serif" w:hAnsi="Google Sans;sans-serif"/>
+          <w:b w:val="false"/>
           <w:b w:val="false"/>
           <w:strike w:val="false"/>
           <w:dstrike w:val="false"/>
@@ -2096,7 +2043,6 @@
           <w:ilvl w:val="0"/>
           <w:numId w:val="4"/>
         </w:numPr>
-        <w:pBdr/>
         <w:tabs>
           <w:tab w:val="clear" w:pos="709"/>
           <w:tab w:val="left" w:pos="0" w:leader="none"/>
@@ -2109,7 +2055,7 @@
       </w:pPr>
       <w:r>
         <w:rPr>
-          <w:rStyle w:val="StrongEmphasis"/>
+          <w:rStyle w:val="Strong"/>
           <w:rFonts w:ascii="Google Sans;sans-serif" w:hAnsi="Google Sans;sans-serif"/>
           <w:b/>
           <w:strike w:val="false"/>
@@ -2140,7 +2086,6 @@
           <w:ilvl w:val="0"/>
           <w:numId w:val="4"/>
         </w:numPr>
-        <w:pBdr/>
         <w:tabs>
           <w:tab w:val="clear" w:pos="709"/>
           <w:tab w:val="left" w:pos="0" w:leader="none"/>
@@ -2153,7 +2098,7 @@
       </w:pPr>
       <w:r>
         <w:rPr>
-          <w:rStyle w:val="StrongEmphasis"/>
+          <w:rStyle w:val="Strong"/>
           <w:rFonts w:ascii="Google Sans;sans-serif" w:hAnsi="Google Sans;sans-serif"/>
           <w:b/>
           <w:strike w:val="false"/>
@@ -2184,7 +2129,6 @@
           <w:ilvl w:val="0"/>
           <w:numId w:val="4"/>
         </w:numPr>
-        <w:pBdr/>
         <w:tabs>
           <w:tab w:val="clear" w:pos="709"/>
           <w:tab w:val="left" w:pos="0" w:leader="none"/>
@@ -2197,7 +2141,7 @@
       </w:pPr>
       <w:r>
         <w:rPr>
-          <w:rStyle w:val="StrongEmphasis"/>
+          <w:rStyle w:val="Strong"/>
           <w:rFonts w:ascii="Google Sans;sans-serif" w:hAnsi="Google Sans;sans-serif"/>
           <w:b/>
           <w:strike w:val="false"/>
@@ -2241,6 +2185,7 @@
         <w:jc w:val="left"/>
         <w:rPr>
           <w:rFonts w:ascii="Google Sans;sans-serif" w:hAnsi="Google Sans;sans-serif"/>
+          <w:b/>
           <w:b/>
           <w:strike w:val="false"/>
           <w:dstrike w:val="false"/>
@@ -2278,7 +2223,7 @@
       <w:tblGrid>
         <w:gridCol w:w="2014"/>
         <w:gridCol w:w="1766"/>
-        <w:gridCol w:w="1841"/>
+        <w:gridCol w:w="1840"/>
         <w:gridCol w:w="4017"/>
       </w:tblGrid>
       <w:tr>
@@ -2294,11 +2239,13 @@
           <w:p>
             <w:pPr>
               <w:pStyle w:val="TableHeading"/>
+              <w:widowControl w:val="false"/>
               <w:bidi w:val="0"/>
               <w:spacing w:before="0" w:after="0"/>
               <w:ind w:left="0" w:right="0" w:hanging="0"/>
               <w:rPr>
                 <w:rFonts w:ascii="Google Sans;sans-serif" w:hAnsi="Google Sans;sans-serif"/>
+                <w:b/>
                 <w:b/>
                 <w:strike w:val="false"/>
                 <w:dstrike w:val="false"/>
@@ -2332,11 +2279,13 @@
           <w:p>
             <w:pPr>
               <w:pStyle w:val="TableHeading"/>
+              <w:widowControl w:val="false"/>
               <w:bidi w:val="0"/>
               <w:spacing w:before="0" w:after="0"/>
               <w:ind w:left="0" w:right="0" w:hanging="0"/>
               <w:rPr>
                 <w:rFonts w:ascii="Google Sans;sans-serif" w:hAnsi="Google Sans;sans-serif"/>
+                <w:b/>
                 <w:b/>
                 <w:strike w:val="false"/>
                 <w:dstrike w:val="false"/>
@@ -2361,7 +2310,7 @@
         </w:tc>
         <w:tc>
           <w:tcPr>
-            <w:tcW w:w="1841" w:type="dxa"/>
+            <w:tcW w:w="1840" w:type="dxa"/>
             <w:tcBorders>
               <w:bottom w:val="single" w:sz="2" w:space="0" w:color="363840"/>
             </w:tcBorders>
@@ -2370,11 +2319,13 @@
           <w:p>
             <w:pPr>
               <w:pStyle w:val="TableHeading"/>
+              <w:widowControl w:val="false"/>
               <w:bidi w:val="0"/>
               <w:spacing w:before="0" w:after="0"/>
               <w:ind w:left="0" w:right="0" w:hanging="0"/>
               <w:rPr>
                 <w:rFonts w:ascii="Google Sans;sans-serif" w:hAnsi="Google Sans;sans-serif"/>
+                <w:b/>
                 <w:b/>
                 <w:strike w:val="false"/>
                 <w:dstrike w:val="false"/>
@@ -2408,11 +2359,13 @@
           <w:p>
             <w:pPr>
               <w:pStyle w:val="TableHeading"/>
+              <w:widowControl w:val="false"/>
               <w:bidi w:val="0"/>
               <w:spacing w:before="0" w:after="0"/>
               <w:ind w:left="0" w:right="0" w:hanging="0"/>
               <w:rPr>
                 <w:rFonts w:ascii="Google Sans;sans-serif" w:hAnsi="Google Sans;sans-serif"/>
+                <w:b/>
                 <w:b/>
                 <w:strike w:val="false"/>
                 <w:dstrike w:val="false"/>
@@ -2449,6 +2402,7 @@
           <w:p>
             <w:pPr>
               <w:pStyle w:val="TableContents"/>
+              <w:widowControl w:val="false"/>
               <w:bidi w:val="0"/>
               <w:spacing w:before="0" w:after="0"/>
               <w:ind w:left="0" w:right="0" w:hanging="0"/>
@@ -2457,7 +2411,7 @@
             </w:pPr>
             <w:r>
               <w:rPr>
-                <w:rStyle w:val="StrongEmphasis"/>
+                <w:rStyle w:val="Strong"/>
                 <w:rFonts w:ascii="Google Sans;sans-serif" w:hAnsi="Google Sans;sans-serif"/>
                 <w:b/>
                 <w:strike w:val="false"/>
@@ -2481,12 +2435,14 @@
           <w:p>
             <w:pPr>
               <w:pStyle w:val="TableContents"/>
+              <w:widowControl w:val="false"/>
               <w:bidi w:val="0"/>
               <w:spacing w:before="0" w:after="0"/>
               <w:ind w:left="0" w:right="0" w:hanging="0"/>
               <w:jc w:val="left"/>
               <w:rPr>
                 <w:rFonts w:ascii="Google Sans;sans-serif" w:hAnsi="Google Sans;sans-serif"/>
+                <w:b w:val="false"/>
                 <w:b w:val="false"/>
                 <w:strike w:val="false"/>
                 <w:dstrike w:val="false"/>
@@ -2511,7 +2467,7 @@
         </w:tc>
         <w:tc>
           <w:tcPr>
-            <w:tcW w:w="1841" w:type="dxa"/>
+            <w:tcW w:w="1840" w:type="dxa"/>
             <w:tcBorders>
               <w:bottom w:val="single" w:sz="2" w:space="0" w:color="363840"/>
             </w:tcBorders>
@@ -2520,12 +2476,14 @@
           <w:p>
             <w:pPr>
               <w:pStyle w:val="TableContents"/>
+              <w:widowControl w:val="false"/>
               <w:bidi w:val="0"/>
               <w:spacing w:before="0" w:after="0"/>
               <w:ind w:left="0" w:right="0" w:hanging="0"/>
               <w:jc w:val="left"/>
               <w:rPr>
                 <w:rFonts w:ascii="Google Sans;sans-serif" w:hAnsi="Google Sans;sans-serif"/>
+                <w:b w:val="false"/>
                 <w:b w:val="false"/>
                 <w:strike w:val="false"/>
                 <w:dstrike w:val="false"/>
@@ -2559,12 +2517,14 @@
           <w:p>
             <w:pPr>
               <w:pStyle w:val="TableContents"/>
+              <w:widowControl w:val="false"/>
               <w:bidi w:val="0"/>
               <w:spacing w:before="0" w:after="0"/>
               <w:ind w:left="0" w:right="0" w:hanging="0"/>
               <w:jc w:val="left"/>
               <w:rPr>
                 <w:rFonts w:ascii="Google Sans;sans-serif" w:hAnsi="Google Sans;sans-serif"/>
+                <w:b w:val="false"/>
                 <w:b w:val="false"/>
                 <w:strike w:val="false"/>
                 <w:dstrike w:val="false"/>
@@ -2601,6 +2561,7 @@
           <w:p>
             <w:pPr>
               <w:pStyle w:val="TableContents"/>
+              <w:widowControl w:val="false"/>
               <w:bidi w:val="0"/>
               <w:spacing w:before="0" w:after="0"/>
               <w:ind w:left="0" w:right="0" w:hanging="0"/>
@@ -2609,7 +2570,7 @@
             </w:pPr>
             <w:r>
               <w:rPr>
-                <w:rStyle w:val="StrongEmphasis"/>
+                <w:rStyle w:val="Strong"/>
                 <w:rFonts w:ascii="Google Sans;sans-serif" w:hAnsi="Google Sans;sans-serif"/>
                 <w:b/>
                 <w:strike w:val="false"/>
@@ -2633,12 +2594,14 @@
           <w:p>
             <w:pPr>
               <w:pStyle w:val="TableContents"/>
+              <w:widowControl w:val="false"/>
               <w:bidi w:val="0"/>
               <w:spacing w:before="0" w:after="0"/>
               <w:ind w:left="0" w:right="0" w:hanging="0"/>
               <w:jc w:val="left"/>
               <w:rPr>
                 <w:rFonts w:ascii="Google Sans;sans-serif" w:hAnsi="Google Sans;sans-serif"/>
+                <w:b w:val="false"/>
                 <w:b w:val="false"/>
                 <w:strike w:val="false"/>
                 <w:dstrike w:val="false"/>
@@ -2663,7 +2626,7 @@
         </w:tc>
         <w:tc>
           <w:tcPr>
-            <w:tcW w:w="1841" w:type="dxa"/>
+            <w:tcW w:w="1840" w:type="dxa"/>
             <w:tcBorders>
               <w:bottom w:val="single" w:sz="2" w:space="0" w:color="363840"/>
             </w:tcBorders>
@@ -2672,12 +2635,14 @@
           <w:p>
             <w:pPr>
               <w:pStyle w:val="TableContents"/>
+              <w:widowControl w:val="false"/>
               <w:bidi w:val="0"/>
               <w:spacing w:before="0" w:after="0"/>
               <w:ind w:left="0" w:right="0" w:hanging="0"/>
               <w:jc w:val="left"/>
               <w:rPr>
                 <w:rFonts w:ascii="Google Sans;sans-serif" w:hAnsi="Google Sans;sans-serif"/>
+                <w:b w:val="false"/>
                 <w:b w:val="false"/>
                 <w:strike w:val="false"/>
                 <w:dstrike w:val="false"/>
@@ -2711,12 +2676,14 @@
           <w:p>
             <w:pPr>
               <w:pStyle w:val="TableContents"/>
+              <w:widowControl w:val="false"/>
               <w:bidi w:val="0"/>
               <w:spacing w:before="0" w:after="0"/>
               <w:ind w:left="0" w:right="0" w:hanging="0"/>
               <w:jc w:val="left"/>
               <w:rPr>
                 <w:rFonts w:ascii="Google Sans;sans-serif" w:hAnsi="Google Sans;sans-serif"/>
+                <w:b w:val="false"/>
                 <w:b w:val="false"/>
                 <w:strike w:val="false"/>
                 <w:dstrike w:val="false"/>
@@ -2753,6 +2720,7 @@
           <w:p>
             <w:pPr>
               <w:pStyle w:val="TableContents"/>
+              <w:widowControl w:val="false"/>
               <w:bidi w:val="0"/>
               <w:spacing w:before="0" w:after="0"/>
               <w:ind w:left="0" w:right="0" w:hanging="0"/>
@@ -2761,7 +2729,7 @@
             </w:pPr>
             <w:r>
               <w:rPr>
-                <w:rStyle w:val="StrongEmphasis"/>
+                <w:rStyle w:val="Strong"/>
                 <w:rFonts w:ascii="Google Sans;sans-serif" w:hAnsi="Google Sans;sans-serif"/>
                 <w:b/>
                 <w:strike w:val="false"/>
@@ -2785,12 +2753,14 @@
           <w:p>
             <w:pPr>
               <w:pStyle w:val="TableContents"/>
+              <w:widowControl w:val="false"/>
               <w:bidi w:val="0"/>
               <w:spacing w:before="0" w:after="0"/>
               <w:ind w:left="0" w:right="0" w:hanging="0"/>
               <w:jc w:val="left"/>
               <w:rPr>
                 <w:rFonts w:ascii="Google Sans;sans-serif" w:hAnsi="Google Sans;sans-serif"/>
+                <w:b w:val="false"/>
                 <w:b w:val="false"/>
                 <w:strike w:val="false"/>
                 <w:dstrike w:val="false"/>
@@ -2815,7 +2785,7 @@
         </w:tc>
         <w:tc>
           <w:tcPr>
-            <w:tcW w:w="1841" w:type="dxa"/>
+            <w:tcW w:w="1840" w:type="dxa"/>
             <w:tcBorders>
               <w:bottom w:val="single" w:sz="2" w:space="0" w:color="363840"/>
             </w:tcBorders>
@@ -2824,12 +2794,14 @@
           <w:p>
             <w:pPr>
               <w:pStyle w:val="TableContents"/>
+              <w:widowControl w:val="false"/>
               <w:bidi w:val="0"/>
               <w:spacing w:before="0" w:after="0"/>
               <w:ind w:left="0" w:right="0" w:hanging="0"/>
               <w:jc w:val="left"/>
               <w:rPr>
                 <w:rFonts w:ascii="Google Sans;sans-serif" w:hAnsi="Google Sans;sans-serif"/>
+                <w:b w:val="false"/>
                 <w:b w:val="false"/>
                 <w:strike w:val="false"/>
                 <w:dstrike w:val="false"/>
@@ -2863,12 +2835,14 @@
           <w:p>
             <w:pPr>
               <w:pStyle w:val="TableContents"/>
+              <w:widowControl w:val="false"/>
               <w:bidi w:val="0"/>
               <w:spacing w:before="0" w:after="0"/>
               <w:ind w:left="0" w:right="0" w:hanging="0"/>
               <w:jc w:val="left"/>
               <w:rPr>
                 <w:rFonts w:ascii="Google Sans;sans-serif" w:hAnsi="Google Sans;sans-serif"/>
+                <w:b w:val="false"/>
                 <w:b w:val="false"/>
                 <w:strike w:val="false"/>
                 <w:dstrike w:val="false"/>
@@ -2905,6 +2879,7 @@
           <w:p>
             <w:pPr>
               <w:pStyle w:val="TableContents"/>
+              <w:widowControl w:val="false"/>
               <w:bidi w:val="0"/>
               <w:spacing w:before="0" w:after="0"/>
               <w:ind w:left="0" w:right="0" w:hanging="0"/>
@@ -2913,7 +2888,7 @@
             </w:pPr>
             <w:r>
               <w:rPr>
-                <w:rStyle w:val="StrongEmphasis"/>
+                <w:rStyle w:val="Strong"/>
                 <w:rFonts w:ascii="Google Sans;sans-serif" w:hAnsi="Google Sans;sans-serif"/>
                 <w:b/>
                 <w:strike w:val="false"/>
@@ -2937,12 +2912,14 @@
           <w:p>
             <w:pPr>
               <w:pStyle w:val="TableContents"/>
+              <w:widowControl w:val="false"/>
               <w:bidi w:val="0"/>
               <w:spacing w:before="0" w:after="0"/>
               <w:ind w:left="0" w:right="0" w:hanging="0"/>
               <w:jc w:val="left"/>
               <w:rPr>
                 <w:rFonts w:ascii="Google Sans;sans-serif" w:hAnsi="Google Sans;sans-serif"/>
+                <w:b w:val="false"/>
                 <w:b w:val="false"/>
                 <w:strike w:val="false"/>
                 <w:dstrike w:val="false"/>
@@ -2967,7 +2944,7 @@
         </w:tc>
         <w:tc>
           <w:tcPr>
-            <w:tcW w:w="1841" w:type="dxa"/>
+            <w:tcW w:w="1840" w:type="dxa"/>
             <w:tcBorders>
               <w:bottom w:val="single" w:sz="2" w:space="0" w:color="363840"/>
             </w:tcBorders>
@@ -2976,12 +2953,14 @@
           <w:p>
             <w:pPr>
               <w:pStyle w:val="TableContents"/>
+              <w:widowControl w:val="false"/>
               <w:bidi w:val="0"/>
               <w:spacing w:before="0" w:after="0"/>
               <w:ind w:left="0" w:right="0" w:hanging="0"/>
               <w:jc w:val="left"/>
               <w:rPr>
                 <w:rFonts w:ascii="Google Sans;sans-serif" w:hAnsi="Google Sans;sans-serif"/>
+                <w:b w:val="false"/>
                 <w:b w:val="false"/>
                 <w:strike w:val="false"/>
                 <w:dstrike w:val="false"/>
@@ -3015,12 +2994,14 @@
           <w:p>
             <w:pPr>
               <w:pStyle w:val="TableContents"/>
+              <w:widowControl w:val="false"/>
               <w:bidi w:val="0"/>
               <w:spacing w:before="0" w:after="0"/>
               <w:ind w:left="0" w:right="0" w:hanging="0"/>
               <w:jc w:val="left"/>
               <w:rPr>
                 <w:rFonts w:ascii="Google Sans;sans-serif" w:hAnsi="Google Sans;sans-serif"/>
+                <w:b w:val="false"/>
                 <w:b w:val="false"/>
                 <w:strike w:val="false"/>
                 <w:dstrike w:val="false"/>
@@ -3057,6 +3038,7 @@
           <w:p>
             <w:pPr>
               <w:pStyle w:val="TableContents"/>
+              <w:widowControl w:val="false"/>
               <w:bidi w:val="0"/>
               <w:spacing w:before="0" w:after="0"/>
               <w:ind w:left="0" w:right="0" w:hanging="0"/>
@@ -3065,7 +3047,7 @@
             </w:pPr>
             <w:r>
               <w:rPr>
-                <w:rStyle w:val="StrongEmphasis"/>
+                <w:rStyle w:val="Strong"/>
                 <w:rFonts w:ascii="Google Sans;sans-serif" w:hAnsi="Google Sans;sans-serif"/>
                 <w:b/>
                 <w:strike w:val="false"/>
@@ -3089,6 +3071,7 @@
           <w:p>
             <w:pPr>
               <w:pStyle w:val="TableContents"/>
+              <w:widowControl w:val="false"/>
               <w:bidi w:val="0"/>
               <w:spacing w:before="0" w:after="0"/>
               <w:ind w:left="0" w:right="0" w:hanging="0"/>
@@ -3096,6 +3079,7 @@
               <w:rPr>
                 <w:rFonts w:ascii="Google Sans;sans-serif" w:hAnsi="Google Sans;sans-serif"/>
                 <w:b w:val="false"/>
+                <w:b w:val="false"/>
                 <w:strike w:val="false"/>
                 <w:dstrike w:val="false"/>
                 <w:sz w:val="21"/>
@@ -3113,13 +3097,25 @@
                 <w:u w:val="none"/>
                 <w:effect w:val="none"/>
               </w:rPr>
-              <w:t>EXTI10</w:t>
+              <w:t>EXTI1</w:t>
+            </w:r>
+            <w:r>
+              <w:rPr>
+                <w:rFonts w:ascii="Google Sans;sans-serif" w:hAnsi="Google Sans;sans-serif"/>
+                <w:b w:val="false"/>
+                <w:strike w:val="false"/>
+                <w:dstrike w:val="false"/>
+                <w:sz w:val="21"/>
+                <w:u w:val="none"/>
+                <w:effect w:val="none"/>
+              </w:rPr>
+              <w:t>6</w:t>
             </w:r>
           </w:p>
         </w:tc>
         <w:tc>
           <w:tcPr>
-            <w:tcW w:w="1841" w:type="dxa"/>
+            <w:tcW w:w="1840" w:type="dxa"/>
             <w:tcBorders>
               <w:bottom w:val="single" w:sz="2" w:space="0" w:color="363840"/>
             </w:tcBorders>
@@ -3128,6 +3124,7 @@
           <w:p>
             <w:pPr>
               <w:pStyle w:val="TableContents"/>
+              <w:widowControl w:val="false"/>
               <w:bidi w:val="0"/>
               <w:spacing w:before="0" w:after="0"/>
               <w:ind w:left="0" w:right="0" w:hanging="0"/>
@@ -3135,6 +3132,7 @@
               <w:rPr>
                 <w:rFonts w:ascii="Google Sans;sans-serif" w:hAnsi="Google Sans;sans-serif"/>
                 <w:b w:val="false"/>
+                <w:b w:val="false"/>
                 <w:strike w:val="false"/>
                 <w:dstrike w:val="false"/>
                 <w:sz w:val="21"/>
@@ -3152,7 +3150,19 @@
                 <w:u w:val="none"/>
                 <w:effect w:val="none"/>
               </w:rPr>
-              <w:t>PA10</w:t>
+              <w:t>P</w:t>
+            </w:r>
+            <w:r>
+              <w:rPr>
+                <w:rFonts w:ascii="Google Sans;sans-serif" w:hAnsi="Google Sans;sans-serif"/>
+                <w:b w:val="false"/>
+                <w:strike w:val="false"/>
+                <w:dstrike w:val="false"/>
+                <w:sz w:val="21"/>
+                <w:u w:val="none"/>
+                <w:effect w:val="none"/>
+              </w:rPr>
+              <w:t>c6</w:t>
             </w:r>
           </w:p>
         </w:tc>
@@ -3167,12 +3177,14 @@
           <w:p>
             <w:pPr>
               <w:pStyle w:val="TableContents"/>
+              <w:widowControl w:val="false"/>
               <w:bidi w:val="0"/>
               <w:spacing w:before="0" w:after="0"/>
               <w:ind w:left="0" w:right="0" w:hanging="0"/>
               <w:jc w:val="left"/>
               <w:rPr>
                 <w:rFonts w:ascii="Google Sans;sans-serif" w:hAnsi="Google Sans;sans-serif"/>
+                <w:b w:val="false"/>
                 <w:b w:val="false"/>
                 <w:strike w:val="false"/>
                 <w:dstrike w:val="false"/>
@@ -3209,6 +3221,7 @@
           <w:p>
             <w:pPr>
               <w:pStyle w:val="TableContents"/>
+              <w:widowControl w:val="false"/>
               <w:bidi w:val="0"/>
               <w:spacing w:before="0" w:after="0"/>
               <w:ind w:left="0" w:right="0" w:hanging="0"/>
@@ -3217,7 +3230,7 @@
             </w:pPr>
             <w:r>
               <w:rPr>
-                <w:rStyle w:val="StrongEmphasis"/>
+                <w:rStyle w:val="Strong"/>
                 <w:rFonts w:ascii="Google Sans;sans-serif" w:hAnsi="Google Sans;sans-serif"/>
                 <w:b/>
                 <w:strike w:val="false"/>
@@ -3241,12 +3254,14 @@
           <w:p>
             <w:pPr>
               <w:pStyle w:val="TableContents"/>
+              <w:widowControl w:val="false"/>
               <w:bidi w:val="0"/>
               <w:spacing w:before="0" w:after="0"/>
               <w:ind w:left="0" w:right="0" w:hanging="0"/>
               <w:jc w:val="left"/>
               <w:rPr>
                 <w:rFonts w:ascii="Google Sans;sans-serif" w:hAnsi="Google Sans;sans-serif"/>
+                <w:b w:val="false"/>
                 <w:b w:val="false"/>
                 <w:strike w:val="false"/>
                 <w:dstrike w:val="false"/>
@@ -3271,7 +3286,7 @@
         </w:tc>
         <w:tc>
           <w:tcPr>
-            <w:tcW w:w="1841" w:type="dxa"/>
+            <w:tcW w:w="1840" w:type="dxa"/>
             <w:tcBorders>
               <w:bottom w:val="single" w:sz="2" w:space="0" w:color="363840"/>
             </w:tcBorders>
@@ -3280,6 +3295,7 @@
           <w:p>
             <w:pPr>
               <w:pStyle w:val="TableContents"/>
+              <w:widowControl w:val="false"/>
               <w:bidi w:val="0"/>
               <w:spacing w:before="0" w:after="0"/>
               <w:ind w:left="0" w:right="0" w:hanging="0"/>
@@ -3287,6 +3303,7 @@
               <w:rPr>
                 <w:rFonts w:ascii="Google Sans;sans-serif" w:hAnsi="Google Sans;sans-serif"/>
                 <w:b w:val="false"/>
+                <w:b w:val="false"/>
                 <w:strike w:val="false"/>
                 <w:dstrike w:val="false"/>
                 <w:sz w:val="21"/>
@@ -3304,7 +3321,7 @@
                 <w:u w:val="none"/>
                 <w:effect w:val="none"/>
               </w:rPr>
-              <w:t>PA6</w:t>
+              <w:t>pc7</w:t>
             </w:r>
           </w:p>
         </w:tc>
@@ -3319,12 +3336,14 @@
           <w:p>
             <w:pPr>
               <w:pStyle w:val="TableContents"/>
+              <w:widowControl w:val="false"/>
               <w:bidi w:val="0"/>
               <w:spacing w:before="0" w:after="0"/>
               <w:ind w:left="0" w:right="0" w:hanging="0"/>
               <w:jc w:val="left"/>
               <w:rPr>
                 <w:rFonts w:ascii="Google Sans;sans-serif" w:hAnsi="Google Sans;sans-serif"/>
+                <w:b w:val="false"/>
                 <w:b w:val="false"/>
                 <w:strike w:val="false"/>
                 <w:dstrike w:val="false"/>
@@ -3361,6 +3380,7 @@
           <w:p>
             <w:pPr>
               <w:pStyle w:val="TableContents"/>
+              <w:widowControl w:val="false"/>
               <w:bidi w:val="0"/>
               <w:spacing w:before="0" w:after="0"/>
               <w:ind w:left="0" w:right="0" w:hanging="0"/>
@@ -3369,7 +3389,7 @@
             </w:pPr>
             <w:r>
               <w:rPr>
-                <w:rStyle w:val="StrongEmphasis"/>
+                <w:rStyle w:val="Strong"/>
                 <w:rFonts w:ascii="Google Sans;sans-serif" w:hAnsi="Google Sans;sans-serif"/>
                 <w:b/>
                 <w:strike w:val="false"/>
@@ -3393,6 +3413,7 @@
           <w:p>
             <w:pPr>
               <w:pStyle w:val="TableContents"/>
+              <w:widowControl w:val="false"/>
               <w:bidi w:val="0"/>
               <w:spacing w:before="0" w:after="0"/>
               <w:ind w:left="0" w:right="0" w:hanging="0"/>
@@ -3400,6 +3421,7 @@
               <w:rPr>
                 <w:rFonts w:ascii="Google Sans;sans-serif" w:hAnsi="Google Sans;sans-serif"/>
                 <w:b w:val="false"/>
+                <w:b w:val="false"/>
                 <w:strike w:val="false"/>
                 <w:dstrike w:val="false"/>
                 <w:sz w:val="21"/>
@@ -3417,13 +3439,25 @@
                 <w:u w:val="none"/>
                 <w:effect w:val="none"/>
               </w:rPr>
-              <w:t>TIM2</w:t>
+              <w:t>TIM</w:t>
+            </w:r>
+            <w:r>
+              <w:rPr>
+                <w:rFonts w:ascii="Google Sans;sans-serif" w:hAnsi="Google Sans;sans-serif"/>
+                <w:b w:val="false"/>
+                <w:strike w:val="false"/>
+                <w:dstrike w:val="false"/>
+                <w:sz w:val="21"/>
+                <w:u w:val="none"/>
+                <w:effect w:val="none"/>
+              </w:rPr>
+              <w:t>3</w:t>
             </w:r>
           </w:p>
         </w:tc>
         <w:tc>
           <w:tcPr>
-            <w:tcW w:w="1841" w:type="dxa"/>
+            <w:tcW w:w="1840" w:type="dxa"/>
             <w:tcBorders>
               <w:bottom w:val="single" w:sz="2" w:space="0" w:color="363840"/>
             </w:tcBorders>
@@ -3432,12 +3466,14 @@
           <w:p>
             <w:pPr>
               <w:pStyle w:val="TableContents"/>
+              <w:widowControl w:val="false"/>
               <w:bidi w:val="0"/>
               <w:spacing w:before="0" w:after="0"/>
               <w:ind w:left="0" w:right="0" w:hanging="0"/>
               <w:jc w:val="left"/>
               <w:rPr>
                 <w:rFonts w:ascii="Google Sans;sans-serif" w:hAnsi="Google Sans;sans-serif"/>
+                <w:b w:val="false"/>
                 <w:b w:val="false"/>
                 <w:strike w:val="false"/>
                 <w:dstrike w:val="false"/>
@@ -3471,12 +3507,14 @@
           <w:p>
             <w:pPr>
               <w:pStyle w:val="TableContents"/>
+              <w:widowControl w:val="false"/>
               <w:bidi w:val="0"/>
               <w:spacing w:before="0" w:after="0"/>
               <w:ind w:left="0" w:right="0" w:hanging="0"/>
               <w:jc w:val="left"/>
               <w:rPr>
                 <w:rFonts w:ascii="Google Sans;sans-serif" w:hAnsi="Google Sans;sans-serif"/>
+                <w:b w:val="false"/>
                 <w:b w:val="false"/>
                 <w:strike w:val="false"/>
                 <w:dstrike w:val="false"/>
@@ -3513,6 +3551,7 @@
           <w:p>
             <w:pPr>
               <w:pStyle w:val="TableContents"/>
+              <w:widowControl w:val="false"/>
               <w:bidi w:val="0"/>
               <w:spacing w:before="0" w:after="0"/>
               <w:ind w:left="0" w:right="0" w:hanging="0"/>
@@ -3521,7 +3560,7 @@
             </w:pPr>
             <w:r>
               <w:rPr>
-                <w:rStyle w:val="StrongEmphasis"/>
+                <w:rStyle w:val="Strong"/>
                 <w:rFonts w:ascii="Google Sans;sans-serif" w:hAnsi="Google Sans;sans-serif"/>
                 <w:b/>
                 <w:strike w:val="false"/>
@@ -3545,12 +3584,14 @@
           <w:p>
             <w:pPr>
               <w:pStyle w:val="TableContents"/>
+              <w:widowControl w:val="false"/>
               <w:bidi w:val="0"/>
               <w:spacing w:before="0" w:after="0"/>
               <w:ind w:left="0" w:right="0" w:hanging="0"/>
               <w:jc w:val="left"/>
               <w:rPr>
                 <w:rFonts w:ascii="Google Sans;sans-serif" w:hAnsi="Google Sans;sans-serif"/>
+                <w:b w:val="false"/>
                 <w:b w:val="false"/>
                 <w:strike w:val="false"/>
                 <w:dstrike w:val="false"/>
@@ -3575,7 +3616,7 @@
         </w:tc>
         <w:tc>
           <w:tcPr>
-            <w:tcW w:w="1841" w:type="dxa"/>
+            <w:tcW w:w="1840" w:type="dxa"/>
             <w:tcBorders>
               <w:bottom w:val="single" w:sz="2" w:space="0" w:color="363840"/>
             </w:tcBorders>
@@ -3584,12 +3625,14 @@
           <w:p>
             <w:pPr>
               <w:pStyle w:val="TableContents"/>
+              <w:widowControl w:val="false"/>
               <w:bidi w:val="0"/>
               <w:spacing w:before="0" w:after="0"/>
               <w:ind w:left="0" w:right="0" w:hanging="0"/>
               <w:jc w:val="left"/>
               <w:rPr>
                 <w:rFonts w:ascii="Google Sans;sans-serif" w:hAnsi="Google Sans;sans-serif"/>
+                <w:b w:val="false"/>
                 <w:b w:val="false"/>
                 <w:strike w:val="false"/>
                 <w:dstrike w:val="false"/>
@@ -3623,12 +3666,14 @@
           <w:p>
             <w:pPr>
               <w:pStyle w:val="TableContents"/>
+              <w:widowControl w:val="false"/>
               <w:bidi w:val="0"/>
               <w:spacing w:before="0" w:after="0"/>
               <w:ind w:left="0" w:right="0" w:hanging="0"/>
               <w:jc w:val="left"/>
               <w:rPr>
                 <w:rFonts w:ascii="Google Sans;sans-serif" w:hAnsi="Google Sans;sans-serif"/>
+                <w:b w:val="false"/>
                 <w:b w:val="false"/>
                 <w:strike w:val="false"/>
                 <w:dstrike w:val="false"/>
@@ -3665,6 +3710,7 @@
           <w:p>
             <w:pPr>
               <w:pStyle w:val="TableContents"/>
+              <w:widowControl w:val="false"/>
               <w:bidi w:val="0"/>
               <w:spacing w:before="0" w:after="0"/>
               <w:ind w:left="0" w:right="0" w:hanging="0"/>
@@ -3673,7 +3719,7 @@
             </w:pPr>
             <w:r>
               <w:rPr>
-                <w:rStyle w:val="StrongEmphasis"/>
+                <w:rStyle w:val="Strong"/>
                 <w:rFonts w:ascii="Google Sans;sans-serif" w:hAnsi="Google Sans;sans-serif"/>
                 <w:b/>
                 <w:strike w:val="false"/>
@@ -3697,12 +3743,14 @@
           <w:p>
             <w:pPr>
               <w:pStyle w:val="TableContents"/>
+              <w:widowControl w:val="false"/>
               <w:bidi w:val="0"/>
               <w:spacing w:before="0" w:after="0"/>
               <w:ind w:left="0" w:right="0" w:hanging="0"/>
               <w:jc w:val="left"/>
               <w:rPr>
                 <w:rFonts w:ascii="Google Sans;sans-serif" w:hAnsi="Google Sans;sans-serif"/>
+                <w:b w:val="false"/>
                 <w:b w:val="false"/>
                 <w:strike w:val="false"/>
                 <w:dstrike w:val="false"/>
@@ -3727,7 +3775,7 @@
         </w:tc>
         <w:tc>
           <w:tcPr>
-            <w:tcW w:w="1841" w:type="dxa"/>
+            <w:tcW w:w="1840" w:type="dxa"/>
             <w:tcBorders>
               <w:bottom w:val="single" w:sz="2" w:space="0" w:color="363840"/>
             </w:tcBorders>
@@ -3736,12 +3784,14 @@
           <w:p>
             <w:pPr>
               <w:pStyle w:val="TableContents"/>
+              <w:widowControl w:val="false"/>
               <w:bidi w:val="0"/>
               <w:spacing w:before="0" w:after="0"/>
               <w:ind w:left="0" w:right="0" w:hanging="0"/>
               <w:jc w:val="left"/>
               <w:rPr>
                 <w:rFonts w:ascii="Google Sans;sans-serif" w:hAnsi="Google Sans;sans-serif"/>
+                <w:b w:val="false"/>
                 <w:b w:val="false"/>
                 <w:strike w:val="false"/>
                 <w:dstrike w:val="false"/>
@@ -3775,12 +3825,14 @@
           <w:p>
             <w:pPr>
               <w:pStyle w:val="TableContents"/>
+              <w:widowControl w:val="false"/>
               <w:bidi w:val="0"/>
               <w:spacing w:before="0" w:after="0"/>
               <w:ind w:left="0" w:right="0" w:hanging="0"/>
               <w:jc w:val="left"/>
               <w:rPr>
                 <w:rFonts w:ascii="Google Sans;sans-serif" w:hAnsi="Google Sans;sans-serif"/>
+                <w:b w:val="false"/>
                 <w:b w:val="false"/>
                 <w:strike w:val="false"/>
                 <w:dstrike w:val="false"/>
@@ -3817,6 +3869,7 @@
           <w:p>
             <w:pPr>
               <w:pStyle w:val="TableContents"/>
+              <w:widowControl w:val="false"/>
               <w:bidi w:val="0"/>
               <w:spacing w:before="0" w:after="0"/>
               <w:ind w:left="0" w:right="0" w:hanging="0"/>
@@ -3825,7 +3878,7 @@
             </w:pPr>
             <w:r>
               <w:rPr>
-                <w:rStyle w:val="StrongEmphasis"/>
+                <w:rStyle w:val="Strong"/>
                 <w:rFonts w:ascii="Google Sans;sans-serif" w:hAnsi="Google Sans;sans-serif"/>
                 <w:b/>
                 <w:strike w:val="false"/>
@@ -3849,12 +3902,14 @@
           <w:p>
             <w:pPr>
               <w:pStyle w:val="TableContents"/>
+              <w:widowControl w:val="false"/>
               <w:bidi w:val="0"/>
               <w:spacing w:before="0" w:after="0"/>
               <w:ind w:left="0" w:right="0" w:hanging="0"/>
               <w:jc w:val="left"/>
               <w:rPr>
                 <w:rFonts w:ascii="Google Sans;sans-serif" w:hAnsi="Google Sans;sans-serif"/>
+                <w:b w:val="false"/>
                 <w:b w:val="false"/>
                 <w:strike w:val="false"/>
                 <w:dstrike w:val="false"/>
@@ -3879,7 +3934,7 @@
         </w:tc>
         <w:tc>
           <w:tcPr>
-            <w:tcW w:w="1841" w:type="dxa"/>
+            <w:tcW w:w="1840" w:type="dxa"/>
             <w:tcBorders>
               <w:bottom w:val="single" w:sz="2" w:space="0" w:color="363840"/>
             </w:tcBorders>
@@ -3888,12 +3943,14 @@
           <w:p>
             <w:pPr>
               <w:pStyle w:val="TableContents"/>
+              <w:widowControl w:val="false"/>
               <w:bidi w:val="0"/>
               <w:spacing w:before="0" w:after="0"/>
               <w:ind w:left="0" w:right="0" w:hanging="0"/>
               <w:jc w:val="left"/>
               <w:rPr>
                 <w:rFonts w:ascii="Google Sans;sans-serif" w:hAnsi="Google Sans;sans-serif"/>
+                <w:b w:val="false"/>
                 <w:b w:val="false"/>
                 <w:strike w:val="false"/>
                 <w:dstrike w:val="false"/>
@@ -3927,12 +3984,14 @@
           <w:p>
             <w:pPr>
               <w:pStyle w:val="TableContents"/>
+              <w:widowControl w:val="false"/>
               <w:bidi w:val="0"/>
               <w:spacing w:before="0" w:after="0"/>
               <w:ind w:left="0" w:right="0" w:hanging="0"/>
               <w:jc w:val="left"/>
               <w:rPr>
                 <w:rFonts w:ascii="Google Sans;sans-serif" w:hAnsi="Google Sans;sans-serif"/>
+                <w:b w:val="false"/>
                 <w:b w:val="false"/>
                 <w:strike w:val="false"/>
                 <w:dstrike w:val="false"/>
@@ -3970,6 +4029,7 @@
           <w:p>
             <w:pPr>
               <w:pStyle w:val="TableContents"/>
+              <w:widowControl w:val="false"/>
               <w:bidi w:val="0"/>
               <w:spacing w:before="0" w:after="0"/>
               <w:ind w:left="0" w:right="0" w:hanging="0"/>
@@ -3978,7 +4038,7 @@
             </w:pPr>
             <w:r>
               <w:rPr>
-                <w:rStyle w:val="StrongEmphasis"/>
+                <w:rStyle w:val="Strong"/>
                 <w:rFonts w:ascii="Google Sans;sans-serif" w:hAnsi="Google Sans;sans-serif"/>
                 <w:b/>
                 <w:strike w:val="false"/>
@@ -4003,12 +4063,14 @@
           <w:p>
             <w:pPr>
               <w:pStyle w:val="TableContents"/>
+              <w:widowControl w:val="false"/>
               <w:bidi w:val="0"/>
               <w:spacing w:before="0" w:after="0"/>
               <w:ind w:left="0" w:right="0" w:hanging="0"/>
               <w:jc w:val="left"/>
               <w:rPr>
                 <w:rFonts w:ascii="Google Sans;sans-serif" w:hAnsi="Google Sans;sans-serif"/>
+                <w:b w:val="false"/>
                 <w:b w:val="false"/>
                 <w:strike w:val="false"/>
                 <w:dstrike w:val="false"/>
@@ -4033,7 +4095,7 @@
         </w:tc>
         <w:tc>
           <w:tcPr>
-            <w:tcW w:w="1841" w:type="dxa"/>
+            <w:tcW w:w="1840" w:type="dxa"/>
             <w:tcBorders/>
             <w:tcMar>
               <w:bottom w:w="0" w:type="dxa"/>
@@ -4043,12 +4105,14 @@
           <w:p>
             <w:pPr>
               <w:pStyle w:val="TableContents"/>
+              <w:widowControl w:val="false"/>
               <w:bidi w:val="0"/>
               <w:spacing w:before="0" w:after="0"/>
               <w:ind w:left="0" w:right="0" w:hanging="0"/>
               <w:jc w:val="left"/>
               <w:rPr>
                 <w:rFonts w:ascii="Google Sans;sans-serif" w:hAnsi="Google Sans;sans-serif"/>
+                <w:b w:val="false"/>
                 <w:b w:val="false"/>
                 <w:strike w:val="false"/>
                 <w:dstrike w:val="false"/>
@@ -4083,6 +4147,7 @@
           <w:p>
             <w:pPr>
               <w:pStyle w:val="TableContents"/>
+              <w:widowControl w:val="false"/>
               <w:bidi w:val="0"/>
               <w:spacing w:before="0" w:after="0"/>
               <w:ind w:left="0" w:right="0" w:hanging="0"/>
@@ -4156,6 +4221,7 @@
         <w:rPr>
           <w:rFonts w:ascii="Google Sans;sans-serif" w:hAnsi="Google Sans;sans-serif"/>
           <w:b/>
+          <w:b/>
           <w:strike w:val="false"/>
           <w:dstrike w:val="false"/>
           <w:sz w:val="30"/>
@@ -4186,6 +4252,7 @@
         <w:rPr>
           <w:rFonts w:ascii="Google Sans;sans-serif" w:hAnsi="Google Sans;sans-serif"/>
           <w:b w:val="false"/>
+          <w:b w:val="false"/>
           <w:strike w:val="false"/>
           <w:dstrike w:val="false"/>
           <w:sz w:val="24"/>
@@ -4209,7 +4276,6 @@
     <w:p>
       <w:pPr>
         <w:pStyle w:val="PreformattedText"/>
-        <w:pBdr/>
         <w:bidi w:val="0"/>
         <w:spacing w:before="0" w:after="0"/>
         <w:ind w:left="0" w:right="0" w:hanging="0"/>
@@ -4232,7 +4298,6 @@
     <w:p>
       <w:pPr>
         <w:pStyle w:val="PreformattedText"/>
-        <w:pBdr/>
         <w:bidi w:val="0"/>
         <w:spacing w:before="0" w:after="0"/>
         <w:rPr/>
@@ -4244,7 +4309,6 @@
     <w:p>
       <w:pPr>
         <w:pStyle w:val="PreformattedText"/>
-        <w:pBdr/>
         <w:bidi w:val="0"/>
         <w:spacing w:before="0" w:after="0"/>
         <w:rPr/>
@@ -4266,7 +4330,6 @@
     <w:p>
       <w:pPr>
         <w:pStyle w:val="PreformattedText"/>
-        <w:pBdr/>
         <w:bidi w:val="0"/>
         <w:spacing w:before="0" w:after="0"/>
         <w:rPr/>
@@ -4288,7 +4351,6 @@
     <w:p>
       <w:pPr>
         <w:pStyle w:val="PreformattedText"/>
-        <w:pBdr/>
         <w:bidi w:val="0"/>
         <w:spacing w:before="0" w:after="0"/>
         <w:rPr/>
@@ -4300,7 +4362,6 @@
     <w:p>
       <w:pPr>
         <w:pStyle w:val="PreformattedText"/>
-        <w:pBdr/>
         <w:bidi w:val="0"/>
         <w:spacing w:before="0" w:after="0"/>
         <w:rPr/>
@@ -4332,7 +4393,6 @@
     <w:p>
       <w:pPr>
         <w:pStyle w:val="PreformattedText"/>
-        <w:pBdr/>
         <w:bidi w:val="0"/>
         <w:spacing w:before="0" w:after="0"/>
         <w:rPr/>
@@ -4364,7 +4424,6 @@
     <w:p>
       <w:pPr>
         <w:pStyle w:val="PreformattedText"/>
-        <w:pBdr/>
         <w:bidi w:val="0"/>
         <w:spacing w:before="0" w:after="0"/>
         <w:rPr/>
@@ -4386,7 +4445,6 @@
     <w:p>
       <w:pPr>
         <w:pStyle w:val="PreformattedText"/>
-        <w:pBdr/>
         <w:bidi w:val="0"/>
         <w:spacing w:before="0" w:after="0"/>
         <w:rPr/>
@@ -4398,7 +4456,6 @@
     <w:p>
       <w:pPr>
         <w:pStyle w:val="PreformattedText"/>
-        <w:pBdr/>
         <w:bidi w:val="0"/>
         <w:spacing w:before="0" w:after="0"/>
         <w:rPr/>
@@ -4420,7 +4477,6 @@
     <w:p>
       <w:pPr>
         <w:pStyle w:val="PreformattedText"/>
-        <w:pBdr/>
         <w:bidi w:val="0"/>
         <w:spacing w:before="0" w:after="0"/>
         <w:rPr/>
@@ -4442,7 +4498,6 @@
     <w:p>
       <w:pPr>
         <w:pStyle w:val="PreformattedText"/>
-        <w:pBdr/>
         <w:bidi w:val="0"/>
         <w:spacing w:before="0" w:after="0"/>
         <w:rPr/>
@@ -4464,7 +4519,6 @@
     <w:p>
       <w:pPr>
         <w:pStyle w:val="PreformattedText"/>
-        <w:pBdr/>
         <w:bidi w:val="0"/>
         <w:spacing w:before="0" w:after="0"/>
         <w:rPr/>
@@ -4486,7 +4540,6 @@
     <w:p>
       <w:pPr>
         <w:pStyle w:val="PreformattedText"/>
-        <w:pBdr/>
         <w:bidi w:val="0"/>
         <w:spacing w:before="0" w:after="0"/>
         <w:rPr/>
@@ -4518,7 +4571,6 @@
     <w:p>
       <w:pPr>
         <w:pStyle w:val="PreformattedText"/>
-        <w:pBdr/>
         <w:bidi w:val="0"/>
         <w:spacing w:before="0" w:after="0"/>
         <w:rPr/>
@@ -4530,7 +4582,6 @@
     <w:p>
       <w:pPr>
         <w:pStyle w:val="PreformattedText"/>
-        <w:pBdr/>
         <w:bidi w:val="0"/>
         <w:spacing w:before="0" w:after="0"/>
         <w:rPr/>
@@ -4562,7 +4613,6 @@
     <w:p>
       <w:pPr>
         <w:pStyle w:val="PreformattedText"/>
-        <w:pBdr/>
         <w:bidi w:val="0"/>
         <w:spacing w:before="0" w:after="0"/>
         <w:rPr/>
@@ -4594,7 +4644,6 @@
     <w:p>
       <w:pPr>
         <w:pStyle w:val="PreformattedText"/>
-        <w:pBdr/>
         <w:bidi w:val="0"/>
         <w:spacing w:before="0" w:after="0"/>
         <w:rPr/>
@@ -4626,7 +4675,6 @@
     <w:p>
       <w:pPr>
         <w:pStyle w:val="PreformattedText"/>
-        <w:pBdr/>
         <w:bidi w:val="0"/>
         <w:spacing w:before="0" w:after="0"/>
         <w:rPr/>
@@ -4658,7 +4706,6 @@
     <w:p>
       <w:pPr>
         <w:pStyle w:val="PreformattedText"/>
-        <w:pBdr/>
         <w:bidi w:val="0"/>
         <w:spacing w:before="0" w:after="0"/>
         <w:rPr/>
@@ -4696,6 +4743,7 @@
         <w:jc w:val="left"/>
         <w:rPr>
           <w:rFonts w:ascii="Google Sans;sans-serif" w:hAnsi="Google Sans;sans-serif"/>
+          <w:b/>
           <w:b/>
           <w:strike w:val="false"/>
           <w:dstrike w:val="false"/>
@@ -4724,7 +4772,6 @@
           <w:ilvl w:val="0"/>
           <w:numId w:val="5"/>
         </w:numPr>
-        <w:pBdr/>
         <w:tabs>
           <w:tab w:val="clear" w:pos="709"/>
           <w:tab w:val="left" w:pos="0" w:leader="none"/>
@@ -4737,7 +4784,7 @@
       </w:pPr>
       <w:r>
         <w:rPr>
-          <w:rStyle w:val="StrongEmphasis"/>
+          <w:rStyle w:val="Strong"/>
           <w:rFonts w:ascii="Google Sans;sans-serif" w:hAnsi="Google Sans;sans-serif"/>
           <w:b/>
           <w:strike w:val="false"/>
@@ -4768,7 +4815,6 @@
           <w:ilvl w:val="0"/>
           <w:numId w:val="5"/>
         </w:numPr>
-        <w:pBdr/>
         <w:tabs>
           <w:tab w:val="clear" w:pos="709"/>
           <w:tab w:val="left" w:pos="0" w:leader="none"/>
@@ -4781,7 +4827,7 @@
       </w:pPr>
       <w:r>
         <w:rPr>
-          <w:rStyle w:val="StrongEmphasis"/>
+          <w:rStyle w:val="Strong"/>
           <w:rFonts w:ascii="Google Sans;sans-serif" w:hAnsi="Google Sans;sans-serif"/>
           <w:b/>
           <w:strike w:val="false"/>
@@ -4812,7 +4858,6 @@
           <w:ilvl w:val="0"/>
           <w:numId w:val="5"/>
         </w:numPr>
-        <w:pBdr/>
         <w:tabs>
           <w:tab w:val="clear" w:pos="709"/>
           <w:tab w:val="left" w:pos="0" w:leader="none"/>
@@ -4825,7 +4870,7 @@
       </w:pPr>
       <w:r>
         <w:rPr>
-          <w:rStyle w:val="StrongEmphasis"/>
+          <w:rStyle w:val="Strong"/>
           <w:rFonts w:ascii="Google Sans;sans-serif" w:hAnsi="Google Sans;sans-serif"/>
           <w:b/>
           <w:strike w:val="false"/>
@@ -4856,7 +4901,6 @@
           <w:ilvl w:val="0"/>
           <w:numId w:val="5"/>
         </w:numPr>
-        <w:pBdr/>
         <w:tabs>
           <w:tab w:val="clear" w:pos="709"/>
           <w:tab w:val="left" w:pos="0" w:leader="none"/>
@@ -4869,7 +4913,7 @@
       </w:pPr>
       <w:r>
         <w:rPr>
-          <w:rStyle w:val="StrongEmphasis"/>
+          <w:rStyle w:val="Strong"/>
           <w:rFonts w:ascii="Google Sans;sans-serif" w:hAnsi="Google Sans;sans-serif"/>
           <w:b/>
           <w:strike w:val="false"/>
@@ -4903,6 +4947,7 @@
         <w:rPr>
           <w:rFonts w:ascii="Google Sans;sans-serif" w:hAnsi="Google Sans;sans-serif"/>
           <w:b/>
+          <w:b/>
           <w:strike w:val="false"/>
           <w:dstrike w:val="false"/>
           <w:sz w:val="30"/>
@@ -4932,6 +4977,7 @@
         <w:jc w:val="left"/>
         <w:rPr>
           <w:rFonts w:ascii="Google Sans;sans-serif" w:hAnsi="Google Sans;sans-serif"/>
+          <w:b w:val="false"/>
           <w:b w:val="false"/>
           <w:strike w:val="false"/>
           <w:dstrike w:val="false"/>
@@ -4960,7 +5006,6 @@
           <w:ilvl w:val="0"/>
           <w:numId w:val="6"/>
         </w:numPr>
-        <w:pBdr/>
         <w:tabs>
           <w:tab w:val="clear" w:pos="709"/>
           <w:tab w:val="left" w:pos="0" w:leader="none"/>
@@ -4973,7 +5018,7 @@
       </w:pPr>
       <w:r>
         <w:rPr>
-          <w:rStyle w:val="StrongEmphasis"/>
+          <w:rStyle w:val="Strong"/>
           <w:rFonts w:ascii="Google Sans;sans-serif" w:hAnsi="Google Sans;sans-serif"/>
           <w:b/>
           <w:strike w:val="false"/>
@@ -5004,7 +5049,6 @@
           <w:ilvl w:val="0"/>
           <w:numId w:val="6"/>
         </w:numPr>
-        <w:pBdr/>
         <w:tabs>
           <w:tab w:val="clear" w:pos="709"/>
           <w:tab w:val="left" w:pos="0" w:leader="none"/>
@@ -5017,7 +5061,7 @@
       </w:pPr>
       <w:r>
         <w:rPr>
-          <w:rStyle w:val="StrongEmphasis"/>
+          <w:rStyle w:val="Strong"/>
           <w:rFonts w:ascii="Google Sans;sans-serif" w:hAnsi="Google Sans;sans-serif"/>
           <w:b/>
           <w:strike w:val="false"/>
@@ -5036,7 +5080,6 @@
           <w:ilvl w:val="1"/>
           <w:numId w:val="6"/>
         </w:numPr>
-        <w:pBdr/>
         <w:tabs>
           <w:tab w:val="clear" w:pos="709"/>
           <w:tab w:val="left" w:pos="0" w:leader="none"/>
@@ -5092,7 +5135,6 @@
           <w:ilvl w:val="1"/>
           <w:numId w:val="6"/>
         </w:numPr>
-        <w:pBdr/>
         <w:tabs>
           <w:tab w:val="clear" w:pos="709"/>
           <w:tab w:val="left" w:pos="0" w:leader="none"/>
@@ -5148,7 +5190,6 @@
           <w:ilvl w:val="1"/>
           <w:numId w:val="6"/>
         </w:numPr>
-        <w:pBdr/>
         <w:tabs>
           <w:tab w:val="clear" w:pos="709"/>
           <w:tab w:val="left" w:pos="0" w:leader="none"/>
@@ -5204,7 +5245,6 @@
           <w:ilvl w:val="1"/>
           <w:numId w:val="6"/>
         </w:numPr>
-        <w:pBdr/>
         <w:tabs>
           <w:tab w:val="clear" w:pos="709"/>
           <w:tab w:val="left" w:pos="0" w:leader="none"/>
@@ -5300,6 +5340,7 @@
         <w:rPr>
           <w:rFonts w:ascii="Google Sans;sans-serif" w:hAnsi="Google Sans;sans-serif"/>
           <w:b/>
+          <w:b/>
           <w:strike w:val="false"/>
           <w:dstrike w:val="false"/>
           <w:sz w:val="30"/>
@@ -5330,6 +5371,7 @@
         <w:rPr>
           <w:rFonts w:ascii="Google Sans;sans-serif" w:hAnsi="Google Sans;sans-serif"/>
           <w:b/>
+          <w:b/>
           <w:strike w:val="false"/>
           <w:dstrike w:val="false"/>
           <w:sz w:val="30"/>
@@ -5360,6 +5402,7 @@
         <w:rPr>
           <w:rFonts w:ascii="Google Sans;sans-serif" w:hAnsi="Google Sans;sans-serif"/>
           <w:b w:val="false"/>
+          <w:b w:val="false"/>
           <w:strike w:val="false"/>
           <w:dstrike w:val="false"/>
           <w:sz w:val="24"/>
@@ -5390,6 +5433,7 @@
         <w:rPr>
           <w:rFonts w:ascii="Google Sans;sans-serif" w:hAnsi="Google Sans;sans-serif"/>
           <w:b/>
+          <w:b/>
           <w:strike w:val="false"/>
           <w:dstrike w:val="false"/>
           <w:sz w:val="30"/>
@@ -5419,6 +5463,7 @@
         <w:jc w:val="left"/>
         <w:rPr>
           <w:rFonts w:ascii="Google Sans;sans-serif" w:hAnsi="Google Sans;sans-serif"/>
+          <w:b w:val="false"/>
           <w:b w:val="false"/>
           <w:strike w:val="false"/>
           <w:dstrike w:val="false"/>
@@ -5466,6 +5511,7 @@
         <w:rPr>
           <w:rFonts w:ascii="Google Sans;sans-serif" w:hAnsi="Google Sans;sans-serif"/>
           <w:b/>
+          <w:b/>
           <w:strike w:val="false"/>
           <w:dstrike w:val="false"/>
           <w:sz w:val="30"/>
@@ -5493,7 +5539,6 @@
           <w:ilvl w:val="0"/>
           <w:numId w:val="7"/>
         </w:numPr>
-        <w:pBdr/>
         <w:tabs>
           <w:tab w:val="clear" w:pos="709"/>
           <w:tab w:val="left" w:pos="0" w:leader="none"/>
@@ -5506,7 +5551,7 @@
       </w:pPr>
       <w:r>
         <w:rPr>
-          <w:rStyle w:val="StrongEmphasis"/>
+          <w:rStyle w:val="Strong"/>
           <w:rFonts w:ascii="Google Sans;sans-serif" w:hAnsi="Google Sans;sans-serif"/>
           <w:b/>
           <w:strike w:val="false"/>
@@ -5537,7 +5582,6 @@
           <w:ilvl w:val="0"/>
           <w:numId w:val="7"/>
         </w:numPr>
-        <w:pBdr/>
         <w:tabs>
           <w:tab w:val="clear" w:pos="709"/>
           <w:tab w:val="left" w:pos="0" w:leader="none"/>
@@ -5550,7 +5594,7 @@
       </w:pPr>
       <w:r>
         <w:rPr>
-          <w:rStyle w:val="StrongEmphasis"/>
+          <w:rStyle w:val="Strong"/>
           <w:rFonts w:ascii="Google Sans;sans-serif" w:hAnsi="Google Sans;sans-serif"/>
           <w:b/>
           <w:strike w:val="false"/>
@@ -5581,7 +5625,6 @@
           <w:ilvl w:val="0"/>
           <w:numId w:val="7"/>
         </w:numPr>
-        <w:pBdr/>
         <w:tabs>
           <w:tab w:val="clear" w:pos="709"/>
           <w:tab w:val="left" w:pos="0" w:leader="none"/>
@@ -5594,7 +5637,7 @@
       </w:pPr>
       <w:r>
         <w:rPr>
-          <w:rStyle w:val="StrongEmphasis"/>
+          <w:rStyle w:val="Strong"/>
           <w:rFonts w:ascii="Google Sans;sans-serif" w:hAnsi="Google Sans;sans-serif"/>
           <w:b/>
           <w:strike w:val="false"/>
@@ -5647,6 +5690,7 @@
       <w:pgNumType w:fmt="decimal"/>
       <w:formProt w:val="false"/>
       <w:textDirection w:val="lrTb"/>
+      <w:docGrid w:type="default" w:linePitch="100" w:charSpace="0"/>
     </w:sectPr>
   </w:body>
 </w:document>
@@ -6739,7 +6783,6 @@
     </w:rPrDefault>
     <w:pPrDefault>
       <w:pPr>
-        <w:widowControl/>
         <w:suppressAutoHyphens w:val="true"/>
       </w:pPr>
     </w:pPrDefault>
@@ -6749,7 +6792,10 @@
     <w:qFormat/>
     <w:pPr>
       <w:widowControl/>
+      <w:suppressAutoHyphens w:val="true"/>
       <w:bidi w:val="0"/>
+      <w:spacing w:before="0" w:after="0"/>
+      <w:jc w:val="left"/>
     </w:pPr>
     <w:rPr>
       <w:rFonts w:ascii="Liberation Serif" w:hAnsi="Liberation Serif" w:eastAsia="Noto Serif CJK SC" w:cs="Lohit Devanagari"/>
@@ -6760,7 +6806,7 @@
       <w:lang w:val="en-IL" w:eastAsia="zh-CN" w:bidi="hi-IN"/>
     </w:rPr>
   </w:style>
-  <w:style w:type="character" w:styleId="StrongEmphasis">
+  <w:style w:type="character" w:styleId="Strong">
     <w:name w:val="Strong"/>
     <w:qFormat/>
     <w:rPr>

</xml_diff>